<commit_message>
complete template page and preview page UI
</commit_message>
<xml_diff>
--- a/src/templates/cancelNotary.docx
+++ b/src/templates/cancelNotary.docx
@@ -314,15 +314,22 @@
     </w:p>
     <w:p>
       <w:pPr>
-        <w:numPr>
-          <w:ilvl w:val="0"/>
-          <w:numId w:val="2"/>
-        </w:numPr>
-        <w:spacing w:lineRule="auto"/>
-      </w:pPr>
-      <w:r>
-        <w:rPr/>
-        <w:t xml:space="preserve">{{%logo}}</w:t>
+        <w:spacing w:lineRule="auto"/>
+      </w:pPr>
+      <w:r>
+        <w:rPr/>
+        <w:br w:type="textWrapping"/>
+      </w:r>
+    </w:p>
+    <w:p>
+      <w:pPr>
+        <w:spacing w:lineRule="auto"/>
+      </w:pPr>
+      <w:r>
+        <w:rPr>
+          <w:color w:val="ffffff"/>
+        </w:rPr>
+        <w:t xml:space="preserve">{%logo}{%logo_2}{%logo_3}{%logo_4}{%logo_5}</w:t>
       </w:r>
     </w:p>
   </w:body>

</xml_diff>